<commit_message>
fix(events): dissocier les orchestres des presences dans la gestion des evenements
</commit_message>
<xml_diff>
--- a/Guide_Espace_Membre_La_Lyre.docx
+++ b/Guide_Espace_Membre_La_Lyre.docx
@@ -6,62 +6,56 @@
       <w:tblPr>
         <w:tblW w:type="auto" w:w="0"/>
         <w:jc w:val="center"/>
+        <w:tblLayout w:type="fixed"/>
         <w:tblLook w:firstColumn="1" w:firstRow="1" w:lastColumn="0" w:lastRow="0" w:noHBand="0" w:noVBand="1" w:val="04A0"/>
       </w:tblPr>
       <w:tblGrid>
-        <w:gridCol w:w="9936"/>
+        <w:gridCol w:w="9605"/>
       </w:tblGrid>
       <w:tr>
         <w:tc>
           <w:tcPr>
-            <w:tcW w:type="dxa" w:w="9792"/>
+            <w:tcW w:type="dxa" w:w="9605"/>
             <w:shd w:fill="1E1B4B"/>
             <w:tcMar>
-              <w:top w:w="260" w:type="dxa"/>
-              <w:bottom w:w="260" w:type="dxa"/>
-              <w:left w:w="300" w:type="dxa"/>
-              <w:right w:w="300" w:type="dxa"/>
+              <w:top w:w="140" w:type="dxa"/>
+              <w:bottom w:w="140" w:type="dxa"/>
+              <w:left w:w="180" w:type="dxa"/>
+              <w:right w:w="180" w:type="dxa"/>
             </w:tcMar>
+            <w:tcBorders>
+              <w:top w:val="none" w:sz="8" w:space="0" w:color="D1D5DB"/>
+              <w:left w:val="none" w:sz="8" w:space="0" w:color="D1D5DB"/>
+              <w:bottom w:val="none" w:sz="8" w:space="0" w:color="D1D5DB"/>
+              <w:right w:val="none" w:sz="8" w:space="0" w:color="D1D5DB"/>
+            </w:tcBorders>
           </w:tcPr>
           <w:p>
             <w:pPr>
-              <w:spacing w:after="80"/>
+              <w:spacing w:before="0" w:after="40"/>
             </w:pPr>
             <w:r>
               <w:rPr>
                 <w:rFonts w:ascii="Calibri" w:hAnsi="Calibri"/>
                 <w:b/>
-                <w:color w:val="A5B4FC"/>
-                <w:sz w:val="20"/>
+                <w:color w:val="C7D2FE"/>
+                <w:sz w:val="19"/>
               </w:rPr>
-              <w:t>SOCIÉTÉ MUSICALE LA LYRE • CHALINDREY (52)</w:t>
+              <w:t>LA LYRE • CHALINDREY</w:t>
             </w:r>
           </w:p>
           <w:p>
             <w:pPr>
-              <w:spacing w:after="120"/>
+              <w:spacing w:before="0" w:after="0"/>
             </w:pPr>
             <w:r>
               <w:rPr>
                 <w:rFonts w:ascii="Calibri" w:hAnsi="Calibri"/>
                 <w:b/>
                 <w:color w:val="FFFFFF"/>
-                <w:sz w:val="44"/>
+                <w:sz w:val="33"/>
               </w:rPr>
               <w:t>Guide Officiel de l'Espace Membre</w:t>
-            </w:r>
-          </w:p>
-          <w:p>
-            <w:pPr>
-              <w:spacing w:after="0"/>
-            </w:pPr>
-            <w:r>
-              <w:rPr>
-                <w:rFonts w:ascii="Calibri" w:hAnsi="Calibri"/>
-                <w:color w:val="CBD5E1"/>
-                <w:sz w:val="22"/>
-              </w:rPr>
-              <w:t>Tutoriel d'activation, gestion des partitions, présences aux répétitions et fonctionnement du compte associatif.</w:t>
             </w:r>
           </w:p>
         </w:tc>
@@ -69,7 +63,7 @@
     </w:tbl>
     <w:p>
       <w:pPr>
-        <w:spacing w:after="200"/>
+        <w:spacing w:before="100" w:after="0"/>
       </w:pPr>
     </w:p>
     <w:tbl>
@@ -80,36 +74,37 @@
         <w:tblLook w:firstColumn="1" w:firstRow="1" w:lastColumn="0" w:lastRow="0" w:noHBand="0" w:noVBand="1" w:val="04A0"/>
       </w:tblPr>
       <w:tblGrid>
-        <w:gridCol w:w="9936"/>
+        <w:gridCol w:w="9605"/>
       </w:tblGrid>
       <w:tr>
         <w:tc>
           <w:tcPr>
-            <w:tcW w:type="dxa" w:w="9360"/>
+            <w:tcW w:type="dxa" w:w="9605"/>
             <w:shd w:fill="F0FDF4"/>
             <w:tcMar>
-              <w:top w:w="160" w:type="dxa"/>
-              <w:bottom w:w="160" w:type="dxa"/>
-              <w:left w:w="240" w:type="dxa"/>
-              <w:right w:w="240" w:type="dxa"/>
+              <w:top w:w="100" w:type="dxa"/>
+              <w:bottom w:w="100" w:type="dxa"/>
+              <w:left w:w="160" w:type="dxa"/>
+              <w:right w:w="140" w:type="dxa"/>
             </w:tcMar>
             <w:tcBorders>
+              <w:top w:val="none" w:sz="24" w:space="0" w:color="10B981"/>
               <w:left w:val="single" w:sz="24" w:space="0" w:color="10B981"/>
-              <w:top w:val="none"/>
-              <w:right w:val="none"/>
-              <w:bottom w:val="none"/>
+              <w:bottom w:val="none" w:sz="24" w:space="0" w:color="10B981"/>
+              <w:right w:val="none" w:sz="24" w:space="0" w:color="10B981"/>
             </w:tcBorders>
           </w:tcPr>
           <w:p>
             <w:pPr>
-              <w:spacing w:before="40" w:after="40" w:line="276" w:lineRule="auto"/>
+              <w:spacing w:before="0" w:after="0" w:line="276" w:lineRule="auto"/>
             </w:pPr>
             <w:r>
               <w:rPr>
                 <w:rFonts w:ascii="Calibri" w:hAnsi="Calibri"/>
                 <w:b/>
-                <w:color w:val="10B981"/>
-                <w:sz w:val="22"/>
+                <w:i w:val="0"/>
+                <w:color w:val="047857"/>
+                <w:sz w:val="20"/>
               </w:rPr>
               <w:t>👋 BIENVENUE SUR VOTRE NOUVEL ESPACE NUMÉRIQUE</w:t>
               <w:br/>
@@ -117,8 +112,10 @@
             <w:r>
               <w:rPr>
                 <w:rFonts w:ascii="Calibri" w:hAnsi="Calibri"/>
+                <w:b w:val="0"/>
+                <w:i w:val="0"/>
                 <w:color w:val="334155"/>
-                <w:sz w:val="20"/>
+                <w:sz w:val="19"/>
               </w:rPr>
               <w:t>La Lyre modernise ses outils ! Chaque musicien et chaque famille dispose désormais d'un accès sécurisé pour retrouver ses partitions, consulter l'agenda des répétitions et concerts, indiquer ses présences et recevoir les informations officielles. Ce document vous guide pas à pas dans vos premiers pas.</w:t>
             </w:r>
@@ -128,203 +125,111 @@
     </w:tbl>
     <w:p>
       <w:pPr>
-        <w:spacing w:after="120"/>
-      </w:pPr>
-    </w:p>
-    <w:p>
-      <w:pPr>
-        <w:pStyle w:val="Heading1"/>
-        <w:spacing w:before="240" w:after="80"/>
+        <w:spacing w:before="240" w:after="60"/>
       </w:pPr>
       <w:r>
         <w:rPr>
+          <w:rFonts w:ascii="Calibri" w:hAnsi="Calibri"/>
+          <w:b/>
           <w:color w:val="1E1B4B"/>
+          <w:sz w:val="25"/>
         </w:rPr>
         <w:t>1. Réception de l'invitation par e-mail</w:t>
       </w:r>
     </w:p>
     <w:p>
       <w:pPr>
-        <w:spacing w:after="120"/>
+        <w:spacing w:before="0" w:after="120" w:line="276" w:lineRule="auto"/>
       </w:pPr>
       <w:r>
-        <w:t>Chaque membre reçoit un e-mail officiel expédié depuis l'adresse communication@lalyre.fr contenant un lien personnalisé unique.</w:t>
+        <w:rPr>
+          <w:rFonts w:ascii="Calibri" w:hAnsi="Calibri"/>
+          <w:sz w:val="19"/>
+        </w:rPr>
+        <w:t xml:space="preserve">Chaque membre reçoit un e-mail officiel expédié depuis l'adresse </w:t>
+      </w:r>
+      <w:r>
+        <w:rPr>
+          <w:rFonts w:ascii="Calibri" w:hAnsi="Calibri"/>
+          <w:b/>
+          <w:sz w:val="19"/>
+        </w:rPr>
+        <w:t>communication@lalyre.fr</w:t>
+      </w:r>
+      <w:r>
+        <w:rPr>
+          <w:rFonts w:ascii="Calibri" w:hAnsi="Calibri"/>
+          <w:sz w:val="19"/>
+        </w:rPr>
+        <w:t xml:space="preserve"> contenant un lien personnalisé unique pour activer son accès :</w:t>
       </w:r>
     </w:p>
     <w:tbl>
       <w:tblPr>
         <w:tblW w:type="auto" w:w="0"/>
         <w:jc w:val="center"/>
+        <w:tblLayout w:type="fixed"/>
         <w:tblLook w:firstColumn="1" w:firstRow="1" w:lastColumn="0" w:lastRow="0" w:noHBand="0" w:noVBand="1" w:val="04A0"/>
       </w:tblPr>
       <w:tblGrid>
-        <w:gridCol w:w="9936"/>
+        <w:gridCol w:w="8640"/>
       </w:tblGrid>
       <w:tr>
         <w:tc>
           <w:tcPr>
-            <w:tcW w:type="dxa" w:w="9360"/>
+            <w:tcW w:type="dxa" w:w="9605"/>
             <w:shd w:fill="F8FAFC"/>
             <w:tcMar>
-              <w:top w:w="180" w:type="dxa"/>
-              <w:bottom w:w="180" w:type="dxa"/>
-              <w:left w:w="240" w:type="dxa"/>
-              <w:right w:w="240" w:type="dxa"/>
+              <w:top w:w="50" w:type="dxa"/>
+              <w:bottom w:w="50" w:type="dxa"/>
+              <w:left w:w="60" w:type="dxa"/>
+              <w:right w:w="60" w:type="dxa"/>
             </w:tcMar>
             <w:tcBorders>
-              <w:left w:val="single" w:sz="8" w:space="0" w:color="CBD5E1"/>
-              <w:top w:val="single" w:sz="8" w:space="0" w:color="CBD5E1"/>
-              <w:right w:val="single" w:sz="8" w:space="0" w:color="CBD5E1"/>
-              <w:bottom w:val="single" w:sz="8" w:space="0" w:color="CBD5E1"/>
+              <w:top w:val="single" w:sz="6" w:space="0" w:color="E2E8F0"/>
+              <w:left w:val="single" w:sz="6" w:space="0" w:color="E2E8F0"/>
+              <w:bottom w:val="single" w:sz="6" w:space="0" w:color="E2E8F0"/>
+              <w:right w:val="single" w:sz="6" w:space="0" w:color="E2E8F0"/>
             </w:tcBorders>
           </w:tcPr>
           <w:p>
             <w:pPr>
-              <w:spacing w:before="0" w:after="80"/>
+              <w:spacing w:before="0" w:after="0"/>
+              <w:jc w:val="center"/>
             </w:pPr>
             <w:r>
-              <w:rPr>
-                <w:rFonts w:ascii="Calibri" w:hAnsi="Calibri"/>
-                <w:b/>
-                <w:color w:val="1E293B"/>
-                <w:sz w:val="20"/>
-              </w:rPr>
-              <w:t>🖥️ APERÇU ÉCRAN : E-MAIL D'INVITATION OFFICIEL REÇU</w:t>
-              <w:br/>
-            </w:r>
-          </w:p>
-          <w:p>
-            <w:pPr>
-              <w:spacing w:before="20" w:after="40" w:line="276" w:lineRule="auto"/>
-            </w:pPr>
-            <w:r>
-              <w:rPr>
-                <w:rFonts w:ascii="Calibri" w:hAnsi="Calibri"/>
-                <w:b/>
-                <w:color w:val="475569"/>
-                <w:sz w:val="19"/>
-              </w:rPr>
-              <w:t xml:space="preserve">Expéditeur : </w:t>
-            </w:r>
-            <w:r>
-              <w:rPr>
-                <w:rFonts w:ascii="Calibri" w:hAnsi="Calibri"/>
-                <w:b w:val="0"/>
-                <w:color w:val="334155"/>
-                <w:sz w:val="19"/>
-              </w:rPr>
-              <w:t>La Lyre - Communication &lt;communication@lalyre.fr&gt;</w:t>
-            </w:r>
-          </w:p>
-          <w:p>
-            <w:pPr>
-              <w:spacing w:before="20" w:after="40" w:line="276" w:lineRule="auto"/>
-            </w:pPr>
-            <w:r>
-              <w:rPr>
-                <w:rFonts w:ascii="Calibri" w:hAnsi="Calibri"/>
-                <w:b/>
-                <w:color w:val="475569"/>
-                <w:sz w:val="19"/>
-              </w:rPr>
-              <w:t xml:space="preserve">Objet : </w:t>
-            </w:r>
-            <w:r>
-              <w:rPr>
-                <w:rFonts w:ascii="Calibri" w:hAnsi="Calibri"/>
-                <w:b/>
-                <w:color w:val="1E293B"/>
-                <w:sz w:val="19"/>
-              </w:rPr>
-              <w:t>Activation de votre compte - La Lyre</w:t>
-            </w:r>
-          </w:p>
-          <w:p>
-            <w:pPr>
-              <w:spacing w:before="20" w:after="40" w:line="276" w:lineRule="auto"/>
-            </w:pPr>
-            <w:r>
-              <w:rPr>
-                <w:rFonts w:ascii="Calibri" w:hAnsi="Calibri"/>
-                <w:b w:val="0"/>
-                <w:color w:val="334155"/>
-                <w:sz w:val="19"/>
-              </w:rPr>
-              <w:t>Bonjour Pierre,</w:t>
-            </w:r>
-          </w:p>
-          <w:p>
-            <w:pPr>
-              <w:spacing w:before="20" w:after="40" w:line="276" w:lineRule="auto"/>
-            </w:pPr>
-            <w:r>
-              <w:rPr>
-                <w:rFonts w:ascii="Calibri" w:hAnsi="Calibri"/>
-                <w:b w:val="0"/>
-                <w:color w:val="334155"/>
-                <w:sz w:val="19"/>
-              </w:rPr>
-              <w:t>Un compte vous a été créé sur le nouvel espace membre de La Lyre de Chalindrey !</w:t>
-            </w:r>
-          </w:p>
-          <w:p>
-            <w:pPr>
-              <w:spacing w:before="20" w:after="40" w:line="276" w:lineRule="auto"/>
-            </w:pPr>
-            <w:r>
-              <w:rPr>
-                <w:rFonts w:ascii="Calibri" w:hAnsi="Calibri"/>
-                <w:b w:val="0"/>
-                <w:color w:val="334155"/>
-                <w:sz w:val="19"/>
-              </w:rPr>
-              <w:t>Cliquez sur le bouton ci-dessous pour choisir votre mot de passe et finaliser votre accès :</w:t>
-            </w:r>
-          </w:p>
-          <w:p>
-            <w:pPr>
-              <w:spacing w:before="20" w:after="40" w:line="276" w:lineRule="auto"/>
-            </w:pPr>
-            <w:r>
-              <w:rPr>
-                <w:rFonts w:ascii="Calibri" w:hAnsi="Calibri"/>
-                <w:b/>
-                <w:color w:val="475569"/>
-                <w:sz w:val="19"/>
-              </w:rPr>
-              <w:t xml:space="preserve">Bouton : </w:t>
-            </w:r>
-            <w:r>
-              <w:rPr>
-                <w:rFonts w:ascii="Calibri" w:hAnsi="Calibri"/>
-                <w:b/>
-                <w:color w:val="4F46E5"/>
-                <w:sz w:val="19"/>
-              </w:rPr>
-              <w:t>[ 👉 ACTIVER MON COMPTE ]</w:t>
-            </w:r>
-          </w:p>
-          <w:p>
-            <w:pPr>
-              <w:spacing w:before="20" w:after="40" w:line="276" w:lineRule="auto"/>
-            </w:pPr>
-            <w:r>
-              <w:rPr>
-                <w:rFonts w:ascii="Calibri" w:hAnsi="Calibri"/>
-                <w:b/>
-                <w:color w:val="475569"/>
-                <w:sz w:val="19"/>
-              </w:rPr>
-              <w:t xml:space="preserve">Information : </w:t>
-            </w:r>
-            <w:r>
-              <w:rPr>
-                <w:rFonts w:ascii="Calibri" w:hAnsi="Calibri"/>
-                <w:b w:val="0"/>
-                <w:color w:val="64748B"/>
-                <w:sz w:val="19"/>
-              </w:rPr>
-              <w:t>Ce lien d'activation sécurisé est valable pendant 48 heures.</w:t>
+              <w:drawing>
+                <wp:inline xmlns:a="http://schemas.openxmlformats.org/drawingml/2006/main" xmlns:pic="http://schemas.openxmlformats.org/drawingml/2006/picture">
+                  <wp:extent cx="5303520" cy="3450950"/>
+                  <wp:docPr id="1" name="Picture 1"/>
+                  <wp:cNvGraphicFramePr>
+                    <a:graphicFrameLocks noChangeAspect="1"/>
+                  </wp:cNvGraphicFramePr>
+                  <a:graphic>
+                    <a:graphicData uri="http://schemas.openxmlformats.org/drawingml/2006/picture">
+                      <pic:pic>
+                        <pic:nvPicPr>
+                          <pic:cNvPr id="0" name="image1.png"/>
+                          <pic:cNvPicPr/>
+                        </pic:nvPicPr>
+                        <pic:blipFill>
+                          <a:blip r:embed="rId10"/>
+                          <a:stretch>
+                            <a:fillRect/>
+                          </a:stretch>
+                        </pic:blipFill>
+                        <pic:spPr>
+                          <a:xfrm>
+                            <a:off x="0" y="0"/>
+                            <a:ext cx="5303520" cy="3450950"/>
+                          </a:xfrm>
+                          <a:prstGeom prst="rect"/>
+                        </pic:spPr>
+                      </pic:pic>
+                    </a:graphicData>
+                  </a:graphic>
+                </wp:inline>
+              </w:drawing>
             </w:r>
           </w:p>
         </w:tc>
@@ -332,7 +237,7 @@
     </w:tbl>
     <w:p>
       <w:pPr>
-        <w:spacing w:after="120"/>
+        <w:spacing w:before="100" w:after="0"/>
       </w:pPr>
     </w:p>
     <w:tbl>
@@ -343,36 +248,37 @@
         <w:tblLook w:firstColumn="1" w:firstRow="1" w:lastColumn="0" w:lastRow="0" w:noHBand="0" w:noVBand="1" w:val="04A0"/>
       </w:tblPr>
       <w:tblGrid>
-        <w:gridCol w:w="9936"/>
+        <w:gridCol w:w="9605"/>
       </w:tblGrid>
       <w:tr>
         <w:tc>
           <w:tcPr>
-            <w:tcW w:type="dxa" w:w="9360"/>
+            <w:tcW w:type="dxa" w:w="9605"/>
             <w:shd w:fill="EFF6FF"/>
             <w:tcMar>
-              <w:top w:w="160" w:type="dxa"/>
-              <w:bottom w:w="160" w:type="dxa"/>
-              <w:left w:w="240" w:type="dxa"/>
-              <w:right w:w="240" w:type="dxa"/>
+              <w:top w:w="100" w:type="dxa"/>
+              <w:bottom w:w="100" w:type="dxa"/>
+              <w:left w:w="160" w:type="dxa"/>
+              <w:right w:w="140" w:type="dxa"/>
             </w:tcMar>
             <w:tcBorders>
+              <w:top w:val="none" w:sz="24" w:space="0" w:color="3B82F6"/>
               <w:left w:val="single" w:sz="24" w:space="0" w:color="3B82F6"/>
-              <w:top w:val="none"/>
-              <w:right w:val="none"/>
-              <w:bottom w:val="none"/>
+              <w:bottom w:val="none" w:sz="24" w:space="0" w:color="3B82F6"/>
+              <w:right w:val="none" w:sz="24" w:space="0" w:color="3B82F6"/>
             </w:tcBorders>
           </w:tcPr>
           <w:p>
             <w:pPr>
-              <w:spacing w:before="40" w:after="40" w:line="276" w:lineRule="auto"/>
+              <w:spacing w:before="0" w:after="0" w:line="276" w:lineRule="auto"/>
             </w:pPr>
             <w:r>
               <w:rPr>
                 <w:rFonts w:ascii="Calibri" w:hAnsi="Calibri"/>
                 <w:b/>
-                <w:color w:val="3B82F6"/>
-                <w:sz w:val="22"/>
+                <w:i w:val="0"/>
+                <w:color w:val="1D4ED8"/>
+                <w:sz w:val="19"/>
               </w:rPr>
               <w:t>💡 ASTUCE IMPORTANTE</w:t>
               <w:br/>
@@ -380,227 +286,46 @@
             <w:r>
               <w:rPr>
                 <w:rFonts w:ascii="Calibri" w:hAnsi="Calibri"/>
+                <w:b w:val="0"/>
+                <w:i w:val="0"/>
                 <w:color w:val="334155"/>
-                <w:sz w:val="20"/>
+                <w:sz w:val="18"/>
               </w:rPr>
-              <w:t>Si l'e-mail n'apparaît pas dans votre boîte de réception principale d'ici quelques minutes, pensez à vérifier votre dossier « Spams / Courriers indésirables » ou l'onglet « Promotions » (sur Gmail).</w:t>
+              <w:t>Si l'e-mail n'apparaît pas dans votre boîte de réception principale d'ici quelques minutes, pensez à vérifier votre dossier « Spams / Courriers indésirables ». Ce lien d'activation sécurisé est valable pendant 48 heures.</w:t>
             </w:r>
           </w:p>
         </w:tc>
       </w:tr>
     </w:tbl>
     <w:p>
-      <w:pPr>
-        <w:spacing w:after="120"/>
-      </w:pPr>
+      <w:r>
+        <w:br w:type="page"/>
+      </w:r>
     </w:p>
     <w:p>
       <w:pPr>
-        <w:pStyle w:val="Heading1"/>
-        <w:spacing w:before="280" w:after="80"/>
+        <w:spacing w:before="40" w:after="60"/>
       </w:pPr>
       <w:r>
         <w:rPr>
+          <w:rFonts w:ascii="Calibri" w:hAnsi="Calibri"/>
+          <w:b/>
           <w:color w:val="1E1B4B"/>
+          <w:sz w:val="25"/>
         </w:rPr>
         <w:t>2. Création de votre mot de passe sécurisé</w:t>
       </w:r>
     </w:p>
     <w:p>
       <w:pPr>
-        <w:spacing w:after="120"/>
-      </w:pPr>
-      <w:r>
-        <w:t>En cliquant sur le lien du mail, vous arrivez sur la page de définition de mot de passe du site lalyre.fr.</w:t>
-      </w:r>
-    </w:p>
-    <w:tbl>
-      <w:tblPr>
-        <w:tblW w:type="auto" w:w="0"/>
-        <w:jc w:val="center"/>
-        <w:tblLook w:firstColumn="1" w:firstRow="1" w:lastColumn="0" w:lastRow="0" w:noHBand="0" w:noVBand="1" w:val="04A0"/>
-      </w:tblPr>
-      <w:tblGrid>
-        <w:gridCol w:w="9936"/>
-      </w:tblGrid>
-      <w:tr>
-        <w:tc>
-          <w:tcPr>
-            <w:tcW w:type="dxa" w:w="9360"/>
-            <w:shd w:fill="F8FAFC"/>
-            <w:tcMar>
-              <w:top w:w="180" w:type="dxa"/>
-              <w:bottom w:w="180" w:type="dxa"/>
-              <w:left w:w="240" w:type="dxa"/>
-              <w:right w:w="240" w:type="dxa"/>
-            </w:tcMar>
-            <w:tcBorders>
-              <w:left w:val="single" w:sz="8" w:space="0" w:color="CBD5E1"/>
-              <w:top w:val="single" w:sz="8" w:space="0" w:color="CBD5E1"/>
-              <w:right w:val="single" w:sz="8" w:space="0" w:color="CBD5E1"/>
-              <w:bottom w:val="single" w:sz="8" w:space="0" w:color="CBD5E1"/>
-            </w:tcBorders>
-          </w:tcPr>
-          <w:p>
-            <w:pPr>
-              <w:spacing w:before="0" w:after="80"/>
-            </w:pPr>
-            <w:r>
-              <w:rPr>
-                <w:rFonts w:ascii="Calibri" w:hAnsi="Calibri"/>
-                <w:b/>
-                <w:color w:val="1E293B"/>
-                <w:sz w:val="20"/>
-              </w:rPr>
-              <w:t>🖥️ APERÇU ÉCRAN : ÉCRAN DE CRÉATION DU MOT DE PASSE</w:t>
-              <w:br/>
-            </w:r>
-          </w:p>
-          <w:p>
-            <w:pPr>
-              <w:spacing w:before="20" w:after="40" w:line="276" w:lineRule="auto"/>
-            </w:pPr>
-            <w:r>
-              <w:rPr>
-                <w:rFonts w:ascii="Calibri" w:hAnsi="Calibri"/>
-                <w:b/>
-                <w:color w:val="475569"/>
-                <w:sz w:val="19"/>
-              </w:rPr>
-              <w:t xml:space="preserve">Champ 1 : </w:t>
-            </w:r>
-            <w:r>
-              <w:rPr>
-                <w:rFonts w:ascii="Calibri" w:hAnsi="Calibri"/>
-                <w:b w:val="0"/>
-                <w:color w:val="334155"/>
-                <w:sz w:val="19"/>
-              </w:rPr>
-              <w:t>Nouveau mot de passe : [ •••••••••••••••• ]</w:t>
-            </w:r>
-          </w:p>
-          <w:p>
-            <w:pPr>
-              <w:spacing w:before="20" w:after="40" w:line="276" w:lineRule="auto"/>
-            </w:pPr>
-            <w:r>
-              <w:rPr>
-                <w:rFonts w:ascii="Calibri" w:hAnsi="Calibri"/>
-                <w:b/>
-                <w:color w:val="475569"/>
-                <w:sz w:val="19"/>
-              </w:rPr>
-              <w:t xml:space="preserve">Champ 2 : </w:t>
-            </w:r>
-            <w:r>
-              <w:rPr>
-                <w:rFonts w:ascii="Calibri" w:hAnsi="Calibri"/>
-                <w:b w:val="0"/>
-                <w:color w:val="334155"/>
-                <w:sz w:val="19"/>
-              </w:rPr>
-              <w:t>Confirmer le mot de passe : [ •••••••••••••••• ]</w:t>
-            </w:r>
-          </w:p>
-          <w:p>
-            <w:pPr>
-              <w:spacing w:before="20" w:after="40" w:line="276" w:lineRule="auto"/>
-            </w:pPr>
-            <w:r>
-              <w:rPr>
-                <w:rFonts w:ascii="Calibri" w:hAnsi="Calibri"/>
-                <w:b/>
-                <w:color w:val="475569"/>
-                <w:sz w:val="19"/>
-              </w:rPr>
-              <w:t xml:space="preserve">Exigences : </w:t>
-            </w:r>
-            <w:r>
-              <w:rPr>
-                <w:rFonts w:ascii="Calibri" w:hAnsi="Calibri"/>
-                <w:b/>
-                <w:color w:val="0F766E"/>
-                <w:sz w:val="19"/>
-              </w:rPr>
-              <w:t>🔒 8 caractères minimum, au moins 1 majuscule, 1 minuscule, 1 chiffre et 1 symbole (!@#$...).</w:t>
-            </w:r>
-          </w:p>
-          <w:p>
-            <w:pPr>
-              <w:spacing w:before="20" w:after="40" w:line="276" w:lineRule="auto"/>
-            </w:pPr>
-            <w:r>
-              <w:rPr>
-                <w:rFonts w:ascii="Calibri" w:hAnsi="Calibri"/>
-                <w:b/>
-                <w:color w:val="475569"/>
-                <w:sz w:val="19"/>
-              </w:rPr>
-              <w:t xml:space="preserve">Action : </w:t>
-            </w:r>
-            <w:r>
-              <w:rPr>
-                <w:rFonts w:ascii="Calibri" w:hAnsi="Calibri"/>
-                <w:b/>
-                <w:color w:val="4F46E5"/>
-                <w:sz w:val="19"/>
-              </w:rPr>
-              <w:t>[ VALIDER ET ACTIVER MON COMPTE ]</w:t>
-            </w:r>
-          </w:p>
-        </w:tc>
-      </w:tr>
-    </w:tbl>
-    <w:p>
-      <w:pPr>
-        <w:spacing w:after="120"/>
-      </w:pPr>
-    </w:p>
-    <w:p>
-      <w:r>
-        <w:t>Une fois validé, votre mot de passe est enregistré et votre compte est automatiquement prêt à l'emploi !</w:t>
-      </w:r>
-    </w:p>
-    <w:p>
-      <w:pPr>
-        <w:pStyle w:val="Heading1"/>
-        <w:spacing w:before="280" w:after="80"/>
+        <w:spacing w:before="0" w:after="120" w:line="276" w:lineRule="auto"/>
       </w:pPr>
       <w:r>
         <w:rPr>
-          <w:color w:val="1E1B4B"/>
+          <w:rFonts w:ascii="Calibri" w:hAnsi="Calibri"/>
+          <w:sz w:val="19"/>
         </w:rPr>
-        <w:t>3. Connexion au quotidien sur lalyre.fr</w:t>
-      </w:r>
-    </w:p>
-    <w:p>
-      <w:r>
-        <w:t>Lors de vos prochaines visites pour préparer vos répétitions :</w:t>
-      </w:r>
-    </w:p>
-    <w:p>
-      <w:pPr>
-        <w:pStyle w:val="ListBullet"/>
-      </w:pPr>
-      <w:r>
-        <w:t>Rendez-vous sur le site officiel : https://lalyre.fr</w:t>
-      </w:r>
-    </w:p>
-    <w:p>
-      <w:pPr>
-        <w:pStyle w:val="ListBullet"/>
-      </w:pPr>
-      <w:r>
-        <w:t>Cliquez sur « Espace Membre » en haut à droite (ou sur lalyre.fr/connexion)</w:t>
-      </w:r>
-    </w:p>
-    <w:p>
-      <w:pPr>
-        <w:pStyle w:val="ListBullet"/>
-        <w:spacing w:after="120"/>
-      </w:pPr>
-      <w:r>
-        <w:t>Renseignez votre adresse e-mail et votre mot de passe.</w:t>
+        <w:t>En cliquant sur le bouton « Activer mon espace membre » du mail, vous arrivez directement sur la page de définition de mot de passe du site :</w:t>
       </w:r>
     </w:p>
     <w:tbl>
@@ -611,36 +336,214 @@
         <w:tblLook w:firstColumn="1" w:firstRow="1" w:lastColumn="0" w:lastRow="0" w:noHBand="0" w:noVBand="1" w:val="04A0"/>
       </w:tblPr>
       <w:tblGrid>
-        <w:gridCol w:w="9936"/>
+        <w:gridCol w:w="5184"/>
       </w:tblGrid>
       <w:tr>
         <w:tc>
           <w:tcPr>
-            <w:tcW w:type="dxa" w:w="9360"/>
-            <w:shd w:fill="FFFBEB"/>
+            <w:tcW w:type="dxa" w:w="9605"/>
+            <w:shd w:fill="F8FAFC"/>
             <w:tcMar>
-              <w:top w:w="160" w:type="dxa"/>
-              <w:bottom w:w="160" w:type="dxa"/>
-              <w:left w:w="240" w:type="dxa"/>
-              <w:right w:w="240" w:type="dxa"/>
+              <w:top w:w="50" w:type="dxa"/>
+              <w:bottom w:w="50" w:type="dxa"/>
+              <w:left w:w="60" w:type="dxa"/>
+              <w:right w:w="60" w:type="dxa"/>
             </w:tcMar>
             <w:tcBorders>
-              <w:left w:val="single" w:sz="24" w:space="0" w:color="F59E0B"/>
-              <w:top w:val="none"/>
-              <w:right w:val="none"/>
-              <w:bottom w:val="none"/>
+              <w:top w:val="single" w:sz="6" w:space="0" w:color="E2E8F0"/>
+              <w:left w:val="single" w:sz="6" w:space="0" w:color="E2E8F0"/>
+              <w:bottom w:val="single" w:sz="6" w:space="0" w:color="E2E8F0"/>
+              <w:right w:val="single" w:sz="6" w:space="0" w:color="E2E8F0"/>
             </w:tcBorders>
           </w:tcPr>
           <w:p>
             <w:pPr>
-              <w:spacing w:before="40" w:after="40" w:line="276" w:lineRule="auto"/>
+              <w:spacing w:before="0" w:after="0"/>
+              <w:jc w:val="center"/>
+            </w:pPr>
+            <w:r>
+              <w:drawing>
+                <wp:inline xmlns:a="http://schemas.openxmlformats.org/drawingml/2006/main" xmlns:pic="http://schemas.openxmlformats.org/drawingml/2006/picture">
+                  <wp:extent cx="3108960" cy="4364130"/>
+                  <wp:docPr id="2" name="Picture 2"/>
+                  <wp:cNvGraphicFramePr>
+                    <a:graphicFrameLocks noChangeAspect="1"/>
+                  </wp:cNvGraphicFramePr>
+                  <a:graphic>
+                    <a:graphicData uri="http://schemas.openxmlformats.org/drawingml/2006/picture">
+                      <pic:pic>
+                        <pic:nvPicPr>
+                          <pic:cNvPr id="0" name="image2.png"/>
+                          <pic:cNvPicPr/>
+                        </pic:nvPicPr>
+                        <pic:blipFill>
+                          <a:blip r:embed="rId11"/>
+                          <a:stretch>
+                            <a:fillRect/>
+                          </a:stretch>
+                        </pic:blipFill>
+                        <pic:spPr>
+                          <a:xfrm>
+                            <a:off x="0" y="0"/>
+                            <a:ext cx="3108960" cy="4364130"/>
+                          </a:xfrm>
+                          <a:prstGeom prst="rect"/>
+                        </pic:spPr>
+                      </pic:pic>
+                    </a:graphicData>
+                  </a:graphic>
+                </wp:inline>
+              </w:drawing>
+            </w:r>
+          </w:p>
+        </w:tc>
+      </w:tr>
+    </w:tbl>
+    <w:p>
+      <w:pPr>
+        <w:spacing w:before="120" w:after="240" w:line="276" w:lineRule="auto"/>
+      </w:pPr>
+      <w:r>
+        <w:rPr>
+          <w:rFonts w:ascii="Calibri" w:hAnsi="Calibri"/>
+          <w:sz w:val="19"/>
+        </w:rPr>
+        <w:t>Renseignez votre mot de passe (8 caractères minimum, avec majuscule, minuscule, chiffre et symbole). Une fois validé, votre mot de passe est enregistré et votre compte est automatiquement prêt à l'emploi !</w:t>
+      </w:r>
+    </w:p>
+    <w:p>
+      <w:pPr>
+        <w:spacing w:before="120" w:after="60"/>
+      </w:pPr>
+      <w:r>
+        <w:rPr>
+          <w:rFonts w:ascii="Calibri" w:hAnsi="Calibri"/>
+          <w:b/>
+          <w:color w:val="1E1B4B"/>
+          <w:sz w:val="25"/>
+        </w:rPr>
+        <w:t>3. Connexion au quotidien sur lalyre.fr</w:t>
+      </w:r>
+    </w:p>
+    <w:p>
+      <w:pPr>
+        <w:spacing w:before="0" w:after="60"/>
+      </w:pPr>
+      <w:r>
+        <w:rPr>
+          <w:rFonts w:ascii="Calibri" w:hAnsi="Calibri"/>
+          <w:sz w:val="19"/>
+        </w:rPr>
+        <w:t>Lors de vos prochaines visites pour préparer vos répétitions :</w:t>
+      </w:r>
+    </w:p>
+    <w:p>
+      <w:pPr>
+        <w:pStyle w:val="ListBullet"/>
+        <w:spacing w:before="20" w:after="40"/>
+      </w:pPr>
+      <w:r>
+        <w:rPr>
+          <w:rFonts w:ascii="Calibri" w:hAnsi="Calibri"/>
+          <w:sz w:val="19"/>
+        </w:rPr>
+        <w:t xml:space="preserve">Rendez-vous sur le site officiel : </w:t>
+      </w:r>
+      <w:r>
+        <w:rPr>
+          <w:rFonts w:ascii="Calibri" w:hAnsi="Calibri"/>
+          <w:b/>
+          <w:sz w:val="19"/>
+        </w:rPr>
+        <w:t>https://lalyre.fr</w:t>
+      </w:r>
+    </w:p>
+    <w:p>
+      <w:pPr>
+        <w:pStyle w:val="ListBullet"/>
+        <w:spacing w:before="20" w:after="40"/>
+      </w:pPr>
+      <w:r>
+        <w:rPr>
+          <w:rFonts w:ascii="Calibri" w:hAnsi="Calibri"/>
+          <w:sz w:val="19"/>
+        </w:rPr>
+        <w:t xml:space="preserve">Cliquez sur </w:t>
+      </w:r>
+      <w:r>
+        <w:rPr>
+          <w:rFonts w:ascii="Calibri" w:hAnsi="Calibri"/>
+          <w:b/>
+          <w:sz w:val="19"/>
+        </w:rPr>
+        <w:t>« Espace Membre » en haut à droite (ou directement sur lalyre.fr/connexion)</w:t>
+      </w:r>
+    </w:p>
+    <w:p>
+      <w:pPr>
+        <w:pStyle w:val="ListBullet"/>
+        <w:spacing w:before="20" w:after="40"/>
+      </w:pPr>
+      <w:r>
+        <w:rPr>
+          <w:rFonts w:ascii="Calibri" w:hAnsi="Calibri"/>
+          <w:sz w:val="19"/>
+        </w:rPr>
+        <w:t xml:space="preserve">Renseignez </w:t>
+      </w:r>
+      <w:r>
+        <w:rPr>
+          <w:rFonts w:ascii="Calibri" w:hAnsi="Calibri"/>
+          <w:b/>
+          <w:sz w:val="19"/>
+        </w:rPr>
+        <w:t>votre adresse e-mail et votre mot de passe.</w:t>
+      </w:r>
+    </w:p>
+    <w:p>
+      <w:pPr>
+        <w:spacing w:before="120" w:after="0"/>
+      </w:pPr>
+    </w:p>
+    <w:tbl>
+      <w:tblPr>
+        <w:tblW w:type="auto" w:w="0"/>
+        <w:jc w:val="center"/>
+        <w:tblLayout w:type="fixed"/>
+        <w:tblLook w:firstColumn="1" w:firstRow="1" w:lastColumn="0" w:lastRow="0" w:noHBand="0" w:noVBand="1" w:val="04A0"/>
+      </w:tblPr>
+      <w:tblGrid>
+        <w:gridCol w:w="9605"/>
+      </w:tblGrid>
+      <w:tr>
+        <w:tc>
+          <w:tcPr>
+            <w:tcW w:type="dxa" w:w="9605"/>
+            <w:shd w:fill="FFFBEB"/>
+            <w:tcMar>
+              <w:top w:w="100" w:type="dxa"/>
+              <w:bottom w:w="100" w:type="dxa"/>
+              <w:left w:w="160" w:type="dxa"/>
+              <w:right w:w="140" w:type="dxa"/>
+            </w:tcMar>
+            <w:tcBorders>
+              <w:top w:val="none" w:sz="24" w:space="0" w:color="F59E0B"/>
+              <w:left w:val="single" w:sz="24" w:space="0" w:color="F59E0B"/>
+              <w:bottom w:val="none" w:sz="24" w:space="0" w:color="F59E0B"/>
+              <w:right w:val="none" w:sz="24" w:space="0" w:color="F59E0B"/>
+            </w:tcBorders>
+          </w:tcPr>
+          <w:p>
+            <w:pPr>
+              <w:spacing w:before="0" w:after="0" w:line="276" w:lineRule="auto"/>
             </w:pPr>
             <w:r>
               <w:rPr>
                 <w:rFonts w:ascii="Calibri" w:hAnsi="Calibri"/>
                 <w:b/>
-                <w:color w:val="F59E0B"/>
-                <w:sz w:val="22"/>
+                <w:i w:val="0"/>
+                <w:color w:val="B45309"/>
+                <w:sz w:val="19"/>
               </w:rPr>
               <w:t>🔑 MOT DE PASSE OUBLIÉ ?</w:t>
               <w:br/>
@@ -648,8 +551,10 @@
             <w:r>
               <w:rPr>
                 <w:rFonts w:ascii="Calibri" w:hAnsi="Calibri"/>
+                <w:b w:val="0"/>
+                <w:i w:val="0"/>
                 <w:color w:val="334155"/>
-                <w:sz w:val="20"/>
+                <w:sz w:val="18"/>
               </w:rPr>
               <w:t>Si vous perdez votre mot de passe, cliquez simplement sur « Mot de passe oublié ? » sur la page de connexion. Un lien de réinitialisation sécurisé vous sera instantanément envoyé par e-mail.</w:t>
             </w:r>
@@ -658,283 +563,34 @@
       </w:tr>
     </w:tbl>
     <w:p>
-      <w:pPr>
-        <w:spacing w:after="120"/>
-      </w:pPr>
+      <w:r>
+        <w:br w:type="page"/>
+      </w:r>
     </w:p>
     <w:p>
       <w:pPr>
-        <w:pStyle w:val="Heading1"/>
-        <w:spacing w:before="280" w:after="80"/>
+        <w:spacing w:before="40" w:after="40"/>
       </w:pPr>
       <w:r>
         <w:rPr>
+          <w:rFonts w:ascii="Calibri" w:hAnsi="Calibri"/>
+          <w:b/>
           <w:color w:val="1E1B4B"/>
+          <w:sz w:val="25"/>
         </w:rPr>
         <w:t>4. Découverte de votre Tableau de Bord (Dashboard)</w:t>
       </w:r>
     </w:p>
     <w:p>
       <w:pPr>
-        <w:spacing w:after="120"/>
-      </w:pPr>
-      <w:r>
-        <w:t>Une fois connecté(e), votre tableau de bord vous présente l'ensemble des éléments personnalisés pour vos orchestres et instruments :</w:t>
-      </w:r>
-    </w:p>
-    <w:tbl>
-      <w:tblPr>
-        <w:tblW w:type="auto" w:w="0"/>
-        <w:jc w:val="center"/>
-        <w:tblLook w:firstColumn="1" w:firstRow="1" w:lastColumn="0" w:lastRow="0" w:noHBand="0" w:noVBand="1" w:val="04A0"/>
-      </w:tblPr>
-      <w:tblGrid>
-        <w:gridCol w:w="9936"/>
-      </w:tblGrid>
-      <w:tr>
-        <w:tc>
-          <w:tcPr>
-            <w:tcW w:type="dxa" w:w="9360"/>
-            <w:shd w:fill="F8FAFC"/>
-            <w:tcMar>
-              <w:top w:w="180" w:type="dxa"/>
-              <w:bottom w:w="180" w:type="dxa"/>
-              <w:left w:w="240" w:type="dxa"/>
-              <w:right w:w="240" w:type="dxa"/>
-            </w:tcMar>
-            <w:tcBorders>
-              <w:left w:val="single" w:sz="8" w:space="0" w:color="CBD5E1"/>
-              <w:top w:val="single" w:sz="8" w:space="0" w:color="CBD5E1"/>
-              <w:right w:val="single" w:sz="8" w:space="0" w:color="CBD5E1"/>
-              <w:bottom w:val="single" w:sz="8" w:space="0" w:color="CBD5E1"/>
-            </w:tcBorders>
-          </w:tcPr>
-          <w:p>
-            <w:pPr>
-              <w:spacing w:before="0" w:after="80"/>
-            </w:pPr>
-            <w:r>
-              <w:rPr>
-                <w:rFonts w:ascii="Calibri" w:hAnsi="Calibri"/>
-                <w:b/>
-                <w:color w:val="1E293B"/>
-                <w:sz w:val="20"/>
-              </w:rPr>
-              <w:t>🖥️ APERÇU ÉCRAN : TABLEAU DE BORD MEMBRE (DASHBOARD)</w:t>
-              <w:br/>
-            </w:r>
-          </w:p>
-          <w:p>
-            <w:pPr>
-              <w:spacing w:before="20" w:after="40" w:line="276" w:lineRule="auto"/>
-            </w:pPr>
-            <w:r>
-              <w:rPr>
-                <w:rFonts w:ascii="Calibri" w:hAnsi="Calibri"/>
-                <w:b/>
-                <w:color w:val="475569"/>
-                <w:sz w:val="19"/>
-              </w:rPr>
-              <w:t xml:space="preserve">Bandeau haut : </w:t>
-            </w:r>
-            <w:r>
-              <w:rPr>
-                <w:rFonts w:ascii="Calibri" w:hAnsi="Calibri"/>
-                <w:b/>
-                <w:color w:val="1E293B"/>
-                <w:sz w:val="19"/>
-              </w:rPr>
-              <w:t>Bonjour Pierre BOISSELIER 👋  |  Clarinette • Saxophone  |  Harmonie • Grand Orchestre</w:t>
-            </w:r>
-          </w:p>
-          <w:p>
-            <w:pPr>
-              <w:spacing w:before="20" w:after="40" w:line="276" w:lineRule="auto"/>
-            </w:pPr>
-            <w:r>
-              <w:rPr>
-                <w:rFonts w:ascii="Calibri" w:hAnsi="Calibri"/>
-                <w:b/>
-                <w:color w:val="475569"/>
-                <w:sz w:val="19"/>
-              </w:rPr>
-              <w:t xml:space="preserve">Notifications : </w:t>
-            </w:r>
-            <w:r>
-              <w:rPr>
-                <w:rFonts w:ascii="Calibri" w:hAnsi="Calibri"/>
-                <w:b w:val="0"/>
-                <w:color w:val="64748B"/>
-                <w:sz w:val="19"/>
-              </w:rPr>
-              <w:t>🔔 Cloche en haut à droite : vous avertit des nouveaux morceaux ou répétitions ajoutés.</w:t>
-            </w:r>
-          </w:p>
-          <w:p>
-            <w:pPr>
-              <w:spacing w:before="20" w:after="40" w:line="276" w:lineRule="auto"/>
-            </w:pPr>
-            <w:r>
-              <w:rPr>
-                <w:rFonts w:ascii="Calibri" w:hAnsi="Calibri"/>
-                <w:b/>
-                <w:color w:val="475569"/>
-                <w:sz w:val="19"/>
-              </w:rPr>
-              <w:t xml:space="preserve">COLONNE GAUCHE : </w:t>
-            </w:r>
-            <w:r>
-              <w:rPr>
-                <w:rFonts w:ascii="Calibri" w:hAnsi="Calibri"/>
-                <w:b/>
-                <w:color w:val="2563EB"/>
-                <w:sz w:val="19"/>
-              </w:rPr>
-              <w:t>📅 Vos Prochains Événements (Répétitions, Concerts, Cérémonies avec horaires et lieux)</w:t>
-            </w:r>
-          </w:p>
-          <w:p>
-            <w:pPr>
-              <w:spacing w:before="20" w:after="40" w:line="276" w:lineRule="auto"/>
-            </w:pPr>
-            <w:r>
-              <w:rPr>
-                <w:rFonts w:ascii="Calibri" w:hAnsi="Calibri"/>
-                <w:b/>
-                <w:color w:val="475569"/>
-                <w:sz w:val="19"/>
-              </w:rPr>
-              <w:t xml:space="preserve">Boutons présence : </w:t>
-            </w:r>
-            <w:r>
-              <w:rPr>
-                <w:rFonts w:ascii="Calibri" w:hAnsi="Calibri"/>
-                <w:b/>
-                <w:color w:val="10B981"/>
-                <w:sz w:val="19"/>
-              </w:rPr>
-              <w:t>[  ✅ JE SERAI PRÉSENT  ]   ou   [  ❌ ABSENT  ]</w:t>
-            </w:r>
-          </w:p>
-          <w:p>
-            <w:pPr>
-              <w:spacing w:before="20" w:after="40" w:line="276" w:lineRule="auto"/>
-            </w:pPr>
-            <w:r>
-              <w:rPr>
-                <w:rFonts w:ascii="Calibri" w:hAnsi="Calibri"/>
-                <w:b/>
-                <w:color w:val="475569"/>
-                <w:sz w:val="19"/>
-              </w:rPr>
-              <w:t xml:space="preserve">COLONNE DROITE : </w:t>
-            </w:r>
-            <w:r>
-              <w:rPr>
-                <w:rFonts w:ascii="Calibri" w:hAnsi="Calibri"/>
-                <w:b/>
-                <w:color w:val="0D9488"/>
-                <w:sz w:val="19"/>
-              </w:rPr>
-              <w:t>🎼 Vos Partitions Numériques classées par orchestre et pupitre avec recherche directe</w:t>
-            </w:r>
-          </w:p>
-          <w:p>
-            <w:pPr>
-              <w:spacing w:before="20" w:after="40" w:line="276" w:lineRule="auto"/>
-            </w:pPr>
-            <w:r>
-              <w:rPr>
-                <w:rFonts w:ascii="Calibri" w:hAnsi="Calibri"/>
-                <w:b/>
-                <w:color w:val="475569"/>
-                <w:sz w:val="19"/>
-              </w:rPr>
-              <w:t xml:space="preserve">Téléchargement : </w:t>
-            </w:r>
-            <w:r>
-              <w:rPr>
-                <w:rFonts w:ascii="Calibri" w:hAnsi="Calibri"/>
-                <w:b w:val="0"/>
-                <w:color w:val="334155"/>
-                <w:sz w:val="19"/>
-              </w:rPr>
-              <w:t>[ ⬇️ Télécharger PDF ] pour afficher la partition en haute définition.</w:t>
-            </w:r>
-          </w:p>
-        </w:tc>
-      </w:tr>
-    </w:tbl>
-    <w:p>
-      <w:pPr>
-        <w:spacing w:after="120"/>
-      </w:pPr>
-    </w:p>
-    <w:p>
-      <w:pPr>
-        <w:pStyle w:val="Heading1"/>
-        <w:spacing w:before="280" w:after="80"/>
+        <w:spacing w:before="0" w:after="100"/>
       </w:pPr>
       <w:r>
         <w:rPr>
-          <w:color w:val="1E1B4B"/>
+          <w:rFonts w:ascii="Calibri" w:hAnsi="Calibri"/>
+          <w:sz w:val="19"/>
         </w:rPr>
-        <w:t>5. Indiquer vos présences aux répétitions et concerts</w:t>
-      </w:r>
-    </w:p>
-    <w:p>
-      <w:r>
-        <w:t>Pour permettre aux chefs d'orchestre d'organiser les répétitions et de connaître l'effectif des pupitres :</w:t>
-      </w:r>
-    </w:p>
-    <w:p>
-      <w:pPr>
-        <w:pStyle w:val="ListBullet"/>
-      </w:pPr>
-      <w:r>
-        <w:t>Cliquez sur « Présent » ou « Absent » directement sur la carte de l'événement.</w:t>
-      </w:r>
-    </w:p>
-    <w:p>
-      <w:pPr>
-        <w:pStyle w:val="ListBullet"/>
-      </w:pPr>
-      <w:r>
-        <w:t>Votre réponse est enregistrée immédiatement (aucun formulaire à remplir).</w:t>
-      </w:r>
-    </w:p>
-    <w:p>
-      <w:pPr>
-        <w:pStyle w:val="ListBullet"/>
-      </w:pPr>
-      <w:r>
-        <w:t>En cas de changement d'agenda, vous pouvez modifier votre choix à tout moment.</w:t>
-      </w:r>
-    </w:p>
-    <w:p>
-      <w:pPr>
-        <w:pStyle w:val="ListBullet"/>
-        <w:spacing w:after="160"/>
-      </w:pPr>
-      <w:r>
-        <w:t>Cliquez sur l'événement pour afficher les informations pratiques (tenue de concert, heure de raccord, partitions à travailler).</w:t>
-      </w:r>
-    </w:p>
-    <w:p>
-      <w:pPr>
-        <w:pStyle w:val="Heading1"/>
-        <w:spacing w:before="280" w:after="80"/>
-      </w:pPr>
-      <w:r>
-        <w:rPr>
-          <w:color w:val="1E1B4B"/>
-        </w:rPr>
-        <w:t>6. Comptes Famille &amp; Gestion Multi-Profils</w:t>
-      </w:r>
-    </w:p>
-    <w:p>
-      <w:r>
-        <w:t>Si une même adresse e-mail est utilisée pour plusieurs membres de la même famille (ex: parents et enfants musiciens) :</w:t>
+        <w:t>Une fois connecté(e), votre tableau de bord vous présente l'ensemble des éléments personnalisés pour vos orchestres et instruments :</w:t>
       </w:r>
     </w:p>
     <w:tbl>
@@ -945,36 +601,478 @@
         <w:tblLook w:firstColumn="1" w:firstRow="1" w:lastColumn="0" w:lastRow="0" w:noHBand="0" w:noVBand="1" w:val="04A0"/>
       </w:tblPr>
       <w:tblGrid>
-        <w:gridCol w:w="9936"/>
+        <w:gridCol w:w="7920"/>
       </w:tblGrid>
       <w:tr>
         <w:tc>
           <w:tcPr>
-            <w:tcW w:type="dxa" w:w="9360"/>
-            <w:shd w:fill="FAF5FF"/>
+            <w:tcW w:type="dxa" w:w="9605"/>
+            <w:shd w:fill="F8FAFC"/>
             <w:tcMar>
-              <w:top w:w="160" w:type="dxa"/>
-              <w:bottom w:w="160" w:type="dxa"/>
-              <w:left w:w="240" w:type="dxa"/>
-              <w:right w:w="240" w:type="dxa"/>
+              <w:top w:w="50" w:type="dxa"/>
+              <w:bottom w:w="50" w:type="dxa"/>
+              <w:left w:w="60" w:type="dxa"/>
+              <w:right w:w="60" w:type="dxa"/>
             </w:tcMar>
             <w:tcBorders>
-              <w:left w:val="single" w:sz="24" w:space="0" w:color="8B5CF6"/>
-              <w:top w:val="none"/>
-              <w:right w:val="none"/>
-              <w:bottom w:val="none"/>
+              <w:top w:val="single" w:sz="6" w:space="0" w:color="E2E8F0"/>
+              <w:left w:val="single" w:sz="6" w:space="0" w:color="E2E8F0"/>
+              <w:bottom w:val="single" w:sz="6" w:space="0" w:color="E2E8F0"/>
+              <w:right w:val="single" w:sz="6" w:space="0" w:color="E2E8F0"/>
             </w:tcBorders>
           </w:tcPr>
           <w:p>
             <w:pPr>
-              <w:spacing w:before="40" w:after="40" w:line="276" w:lineRule="auto"/>
+              <w:spacing w:before="0" w:after="0"/>
+              <w:jc w:val="center"/>
+            </w:pPr>
+            <w:r>
+              <w:drawing>
+                <wp:inline xmlns:a="http://schemas.openxmlformats.org/drawingml/2006/main" xmlns:pic="http://schemas.openxmlformats.org/drawingml/2006/picture">
+                  <wp:extent cx="4846320" cy="3483084"/>
+                  <wp:docPr id="3" name="Picture 3"/>
+                  <wp:cNvGraphicFramePr>
+                    <a:graphicFrameLocks noChangeAspect="1"/>
+                  </wp:cNvGraphicFramePr>
+                  <a:graphic>
+                    <a:graphicData uri="http://schemas.openxmlformats.org/drawingml/2006/picture">
+                      <pic:pic>
+                        <pic:nvPicPr>
+                          <pic:cNvPr id="0" name="image3.png"/>
+                          <pic:cNvPicPr/>
+                        </pic:nvPicPr>
+                        <pic:blipFill>
+                          <a:blip r:embed="rId12"/>
+                          <a:stretch>
+                            <a:fillRect/>
+                          </a:stretch>
+                        </pic:blipFill>
+                        <pic:spPr>
+                          <a:xfrm>
+                            <a:off x="0" y="0"/>
+                            <a:ext cx="4846320" cy="3483084"/>
+                          </a:xfrm>
+                          <a:prstGeom prst="rect"/>
+                        </pic:spPr>
+                      </pic:pic>
+                    </a:graphicData>
+                  </a:graphic>
+                </wp:inline>
+              </w:drawing>
+            </w:r>
+          </w:p>
+        </w:tc>
+      </w:tr>
+    </w:tbl>
+    <w:p>
+      <w:pPr>
+        <w:spacing w:before="140" w:after="60"/>
+      </w:pPr>
+      <w:r>
+        <w:rPr>
+          <w:rFonts w:ascii="Calibri" w:hAnsi="Calibri"/>
+          <w:b/>
+          <w:color w:val="4338CA"/>
+          <w:sz w:val="20"/>
+        </w:rPr>
+        <w:t>📅 Vos Prochains Événements (Répétitions, Concerts, Cérémonies) :</w:t>
+      </w:r>
+    </w:p>
+    <w:tbl>
+      <w:tblPr>
+        <w:tblW w:type="auto" w:w="0"/>
+        <w:jc w:val="center"/>
+        <w:tblLayout w:type="fixed"/>
+        <w:tblLook w:firstColumn="1" w:firstRow="1" w:lastColumn="0" w:lastRow="0" w:noHBand="0" w:noVBand="1" w:val="04A0"/>
+      </w:tblPr>
+      <w:tblGrid>
+        <w:gridCol w:w="7920"/>
+      </w:tblGrid>
+      <w:tr>
+        <w:tc>
+          <w:tcPr>
+            <w:tcW w:type="dxa" w:w="9605"/>
+            <w:shd w:fill="F8FAFC"/>
+            <w:tcMar>
+              <w:top w:w="50" w:type="dxa"/>
+              <w:bottom w:w="50" w:type="dxa"/>
+              <w:left w:w="60" w:type="dxa"/>
+              <w:right w:w="60" w:type="dxa"/>
+            </w:tcMar>
+            <w:tcBorders>
+              <w:top w:val="single" w:sz="6" w:space="0" w:color="E2E8F0"/>
+              <w:left w:val="single" w:sz="6" w:space="0" w:color="E2E8F0"/>
+              <w:bottom w:val="single" w:sz="6" w:space="0" w:color="E2E8F0"/>
+              <w:right w:val="single" w:sz="6" w:space="0" w:color="E2E8F0"/>
+            </w:tcBorders>
+          </w:tcPr>
+          <w:p>
+            <w:pPr>
+              <w:spacing w:before="0" w:after="0"/>
+              <w:jc w:val="center"/>
+            </w:pPr>
+            <w:r>
+              <w:drawing>
+                <wp:inline xmlns:a="http://schemas.openxmlformats.org/drawingml/2006/main" xmlns:pic="http://schemas.openxmlformats.org/drawingml/2006/picture">
+                  <wp:extent cx="4846320" cy="1283547"/>
+                  <wp:docPr id="4" name="Picture 4"/>
+                  <wp:cNvGraphicFramePr>
+                    <a:graphicFrameLocks noChangeAspect="1"/>
+                  </wp:cNvGraphicFramePr>
+                  <a:graphic>
+                    <a:graphicData uri="http://schemas.openxmlformats.org/drawingml/2006/picture">
+                      <pic:pic>
+                        <pic:nvPicPr>
+                          <pic:cNvPr id="0" name="image4.png"/>
+                          <pic:cNvPicPr/>
+                        </pic:nvPicPr>
+                        <pic:blipFill>
+                          <a:blip r:embed="rId13"/>
+                          <a:stretch>
+                            <a:fillRect/>
+                          </a:stretch>
+                        </pic:blipFill>
+                        <pic:spPr>
+                          <a:xfrm>
+                            <a:off x="0" y="0"/>
+                            <a:ext cx="4846320" cy="1283547"/>
+                          </a:xfrm>
+                          <a:prstGeom prst="rect"/>
+                        </pic:spPr>
+                      </pic:pic>
+                    </a:graphicData>
+                  </a:graphic>
+                </wp:inline>
+              </w:drawing>
+            </w:r>
+          </w:p>
+        </w:tc>
+      </w:tr>
+    </w:tbl>
+    <w:p>
+      <w:pPr>
+        <w:spacing w:before="140" w:after="60"/>
+      </w:pPr>
+      <w:r>
+        <w:rPr>
+          <w:rFonts w:ascii="Calibri" w:hAnsi="Calibri"/>
+          <w:b/>
+          <w:color w:val="047857"/>
+          <w:sz w:val="20"/>
+        </w:rPr>
+        <w:t>🎼 Vos Partitions classées par orchestre et pupitre avec recherche directe :</w:t>
+      </w:r>
+    </w:p>
+    <w:tbl>
+      <w:tblPr>
+        <w:tblW w:type="auto" w:w="0"/>
+        <w:jc w:val="center"/>
+        <w:tblLayout w:type="fixed"/>
+        <w:tblLook w:firstColumn="1" w:firstRow="1" w:lastColumn="0" w:lastRow="0" w:noHBand="0" w:noVBand="1" w:val="04A0"/>
+      </w:tblPr>
+      <w:tblGrid>
+        <w:gridCol w:w="7920"/>
+      </w:tblGrid>
+      <w:tr>
+        <w:tc>
+          <w:tcPr>
+            <w:tcW w:type="dxa" w:w="9605"/>
+            <w:shd w:fill="F8FAFC"/>
+            <w:tcMar>
+              <w:top w:w="50" w:type="dxa"/>
+              <w:bottom w:w="50" w:type="dxa"/>
+              <w:left w:w="60" w:type="dxa"/>
+              <w:right w:w="60" w:type="dxa"/>
+            </w:tcMar>
+            <w:tcBorders>
+              <w:top w:val="single" w:sz="6" w:space="0" w:color="E2E8F0"/>
+              <w:left w:val="single" w:sz="6" w:space="0" w:color="E2E8F0"/>
+              <w:bottom w:val="single" w:sz="6" w:space="0" w:color="E2E8F0"/>
+              <w:right w:val="single" w:sz="6" w:space="0" w:color="E2E8F0"/>
+            </w:tcBorders>
+          </w:tcPr>
+          <w:p>
+            <w:pPr>
+              <w:spacing w:before="0" w:after="0"/>
+              <w:jc w:val="center"/>
+            </w:pPr>
+            <w:r>
+              <w:drawing>
+                <wp:inline xmlns:a="http://schemas.openxmlformats.org/drawingml/2006/main" xmlns:pic="http://schemas.openxmlformats.org/drawingml/2006/picture">
+                  <wp:extent cx="4846320" cy="1823268"/>
+                  <wp:docPr id="5" name="Picture 5"/>
+                  <wp:cNvGraphicFramePr>
+                    <a:graphicFrameLocks noChangeAspect="1"/>
+                  </wp:cNvGraphicFramePr>
+                  <a:graphic>
+                    <a:graphicData uri="http://schemas.openxmlformats.org/drawingml/2006/picture">
+                      <pic:pic>
+                        <pic:nvPicPr>
+                          <pic:cNvPr id="0" name="image5.png"/>
+                          <pic:cNvPicPr/>
+                        </pic:nvPicPr>
+                        <pic:blipFill>
+                          <a:blip r:embed="rId14"/>
+                          <a:stretch>
+                            <a:fillRect/>
+                          </a:stretch>
+                        </pic:blipFill>
+                        <pic:spPr>
+                          <a:xfrm>
+                            <a:off x="0" y="0"/>
+                            <a:ext cx="4846320" cy="1823268"/>
+                          </a:xfrm>
+                          <a:prstGeom prst="rect"/>
+                        </pic:spPr>
+                      </pic:pic>
+                    </a:graphicData>
+                  </a:graphic>
+                </wp:inline>
+              </w:drawing>
+            </w:r>
+          </w:p>
+        </w:tc>
+      </w:tr>
+    </w:tbl>
+    <w:p>
+      <w:pPr>
+        <w:spacing w:before="60" w:after="0"/>
+      </w:pPr>
+      <w:r>
+        <w:rPr>
+          <w:rFonts w:ascii="Calibri" w:hAnsi="Calibri"/>
+          <w:color w:val="475569"/>
+          <w:sz w:val="18"/>
+        </w:rPr>
+        <w:t>Cliquez sur le bouton « Ouvrir » en face de votre pupitre pour afficher la partition en haute définition et la télécharger ou l'imprimer.</w:t>
+      </w:r>
+    </w:p>
+    <w:p>
+      <w:r>
+        <w:br w:type="page"/>
+      </w:r>
+    </w:p>
+    <w:p>
+      <w:pPr>
+        <w:spacing w:before="40" w:after="60"/>
+      </w:pPr>
+      <w:r>
+        <w:rPr>
+          <w:rFonts w:ascii="Calibri" w:hAnsi="Calibri"/>
+          <w:b/>
+          <w:color w:val="1E1B4B"/>
+          <w:sz w:val="25"/>
+        </w:rPr>
+        <w:t>5. Indiquer vos présences aux répétitions et concerts</w:t>
+      </w:r>
+    </w:p>
+    <w:p>
+      <w:pPr>
+        <w:spacing w:before="0" w:after="100"/>
+      </w:pPr>
+      <w:r>
+        <w:rPr>
+          <w:rFonts w:ascii="Calibri" w:hAnsi="Calibri"/>
+          <w:sz w:val="19"/>
+        </w:rPr>
+        <w:t>Pour permettre aux chefs d'orchestre d'organiser les répétitions et de connaître l'effectif des pupitres à l'avance :</w:t>
+      </w:r>
+    </w:p>
+    <w:tbl>
+      <w:tblPr>
+        <w:tblW w:type="auto" w:w="0"/>
+        <w:jc w:val="center"/>
+        <w:tblLayout w:type="fixed"/>
+        <w:tblLook w:firstColumn="1" w:firstRow="1" w:lastColumn="0" w:lastRow="0" w:noHBand="0" w:noVBand="1" w:val="04A0"/>
+      </w:tblPr>
+      <w:tblGrid>
+        <w:gridCol w:w="3312"/>
+        <w:gridCol w:w="6293"/>
+      </w:tblGrid>
+      <w:tr>
+        <w:tc>
+          <w:tcPr>
+            <w:tcW w:type="dxa" w:w="4802"/>
+            <w:shd w:fill="F8FAFC"/>
+            <w:tcMar>
+              <w:top w:w="60" w:type="dxa"/>
+              <w:bottom w:w="60" w:type="dxa"/>
+              <w:left w:w="80" w:type="dxa"/>
+              <w:right w:w="80" w:type="dxa"/>
+            </w:tcMar>
+            <w:tcBorders>
+              <w:top w:val="single" w:sz="6" w:space="0" w:color="E2E8F0"/>
+              <w:left w:val="single" w:sz="6" w:space="0" w:color="E2E8F0"/>
+              <w:bottom w:val="single" w:sz="6" w:space="0" w:color="E2E8F0"/>
+              <w:right w:val="single" w:sz="6" w:space="0" w:color="E2E8F0"/>
+            </w:tcBorders>
+          </w:tcPr>
+          <w:p>
+            <w:pPr>
+              <w:spacing w:before="0" w:after="0"/>
+              <w:jc w:val="center"/>
+            </w:pPr>
+            <w:r>
+              <w:drawing>
+                <wp:inline xmlns:a="http://schemas.openxmlformats.org/drawingml/2006/main" xmlns:pic="http://schemas.openxmlformats.org/drawingml/2006/picture">
+                  <wp:extent cx="1737360" cy="1264745"/>
+                  <wp:docPr id="6" name="Picture 6"/>
+                  <wp:cNvGraphicFramePr>
+                    <a:graphicFrameLocks noChangeAspect="1"/>
+                  </wp:cNvGraphicFramePr>
+                  <a:graphic>
+                    <a:graphicData uri="http://schemas.openxmlformats.org/drawingml/2006/picture">
+                      <pic:pic>
+                        <pic:nvPicPr>
+                          <pic:cNvPr id="0" name="image6.png"/>
+                          <pic:cNvPicPr/>
+                        </pic:nvPicPr>
+                        <pic:blipFill>
+                          <a:blip r:embed="rId15"/>
+                          <a:stretch>
+                            <a:fillRect/>
+                          </a:stretch>
+                        </pic:blipFill>
+                        <pic:spPr>
+                          <a:xfrm>
+                            <a:off x="0" y="0"/>
+                            <a:ext cx="1737360" cy="1264745"/>
+                          </a:xfrm>
+                          <a:prstGeom prst="rect"/>
+                        </pic:spPr>
+                      </pic:pic>
+                    </a:graphicData>
+                  </a:graphic>
+                </wp:inline>
+              </w:drawing>
+            </w:r>
+          </w:p>
+        </w:tc>
+        <w:tc>
+          <w:tcPr>
+            <w:tcW w:type="dxa" w:w="4802"/>
+            <w:shd w:fill="FFFFFF"/>
+            <w:tcMar>
+              <w:top w:w="0" w:type="dxa"/>
+              <w:bottom w:w="0" w:type="dxa"/>
+              <w:left w:w="100" w:type="dxa"/>
+              <w:right w:w="0" w:type="dxa"/>
+            </w:tcMar>
+            <w:tcBorders>
+              <w:top w:val="none" w:sz="8" w:space="0" w:color="D1D5DB"/>
+              <w:left w:val="none" w:sz="8" w:space="0" w:color="D1D5DB"/>
+              <w:bottom w:val="none" w:sz="8" w:space="0" w:color="D1D5DB"/>
+              <w:right w:val="none" w:sz="8" w:space="0" w:color="D1D5DB"/>
+            </w:tcBorders>
+          </w:tcPr>
+          <w:p>
+            <w:pPr>
+              <w:pStyle w:val="ListBullet"/>
+              <w:spacing w:before="20" w:after="40" w:line="276" w:lineRule="auto"/>
+            </w:pPr>
+            <w:r>
+              <w:rPr>
+                <w:rFonts w:ascii="Calibri" w:hAnsi="Calibri"/>
+                <w:sz w:val="18"/>
+              </w:rPr>
+              <w:t>Cliquez directement sur « Présent » ou « Absent » pour l'événement concerné.</w:t>
+            </w:r>
+          </w:p>
+          <w:p>
+            <w:pPr>
+              <w:pStyle w:val="ListBullet"/>
+              <w:spacing w:before="20" w:after="40" w:line="276" w:lineRule="auto"/>
+            </w:pPr>
+            <w:r>
+              <w:rPr>
+                <w:rFonts w:ascii="Calibri" w:hAnsi="Calibri"/>
+                <w:sz w:val="18"/>
+              </w:rPr>
+              <w:t>Le bouton sélectionné reste mis en valeur (vert pour Présent, rouge pour Absent).</w:t>
+            </w:r>
+          </w:p>
+          <w:p>
+            <w:pPr>
+              <w:pStyle w:val="ListBullet"/>
+              <w:spacing w:before="20" w:after="40" w:line="276" w:lineRule="auto"/>
+            </w:pPr>
+            <w:r>
+              <w:rPr>
+                <w:rFonts w:ascii="Calibri" w:hAnsi="Calibri"/>
+                <w:sz w:val="18"/>
+              </w:rPr>
+              <w:t>Choix réversible : si vous recliquez sur le même bouton, votre sélection s'annule (état neutre). Vous pouvez modifier votre choix à tout moment.</w:t>
+            </w:r>
+          </w:p>
+          <w:p>
+            <w:pPr>
+              <w:pStyle w:val="ListBullet"/>
+              <w:spacing w:before="20" w:after="40" w:line="276" w:lineRule="auto"/>
+            </w:pPr>
+            <w:r>
+              <w:rPr>
+                <w:rFonts w:ascii="Calibri" w:hAnsi="Calibri"/>
+                <w:sz w:val="18"/>
+              </w:rPr>
+              <w:t>La description et les consignes pratiques (tenue, horaires, raccord) sont directement affichées côte à côte pour chaque événement.</w:t>
+            </w:r>
+          </w:p>
+        </w:tc>
+      </w:tr>
+    </w:tbl>
+    <w:p>
+      <w:pPr>
+        <w:spacing w:before="180" w:after="60"/>
+      </w:pPr>
+      <w:r>
+        <w:rPr>
+          <w:rFonts w:ascii="Calibri" w:hAnsi="Calibri"/>
+          <w:b/>
+          <w:color w:val="1E1B4B"/>
+          <w:sz w:val="25"/>
+        </w:rPr>
+        <w:t>6. Comptes Famille &amp; Gestion Multi-Profils</w:t>
+      </w:r>
+    </w:p>
+    <w:tbl>
+      <w:tblPr>
+        <w:tblW w:type="auto" w:w="0"/>
+        <w:jc w:val="center"/>
+        <w:tblLayout w:type="fixed"/>
+        <w:tblLook w:firstColumn="1" w:firstRow="1" w:lastColumn="0" w:lastRow="0" w:noHBand="0" w:noVBand="1" w:val="04A0"/>
+      </w:tblPr>
+      <w:tblGrid>
+        <w:gridCol w:w="9605"/>
+      </w:tblGrid>
+      <w:tr>
+        <w:tc>
+          <w:tcPr>
+            <w:tcW w:type="dxa" w:w="9605"/>
+            <w:shd w:fill="F5F3FF"/>
+            <w:tcMar>
+              <w:top w:w="100" w:type="dxa"/>
+              <w:bottom w:w="100" w:type="dxa"/>
+              <w:left w:w="160" w:type="dxa"/>
+              <w:right w:w="140" w:type="dxa"/>
+            </w:tcMar>
+            <w:tcBorders>
+              <w:top w:val="none" w:sz="24" w:space="0" w:color="7C3AED"/>
+              <w:left w:val="single" w:sz="24" w:space="0" w:color="7C3AED"/>
+              <w:bottom w:val="none" w:sz="24" w:space="0" w:color="7C3AED"/>
+              <w:right w:val="none" w:sz="24" w:space="0" w:color="7C3AED"/>
+            </w:tcBorders>
+          </w:tcPr>
+          <w:p>
+            <w:pPr>
+              <w:spacing w:before="0" w:after="0" w:line="276" w:lineRule="auto"/>
             </w:pPr>
             <w:r>
               <w:rPr>
                 <w:rFonts w:ascii="Calibri" w:hAnsi="Calibri"/>
                 <w:b/>
-                <w:color w:val="8B5CF6"/>
-                <w:sz w:val="22"/>
+                <w:i w:val="0"/>
+                <w:color w:val="6D28D9"/>
+                <w:sz w:val="19"/>
               </w:rPr>
               <w:t>👨‍👩‍👧‍👦 UN SEUL MOT DE PASSE POUR TOUTE LA FAMILLE</w:t>
               <w:br/>
@@ -982,10 +1080,12 @@
             <w:r>
               <w:rPr>
                 <w:rFonts w:ascii="Calibri" w:hAnsi="Calibri"/>
+                <w:b w:val="0"/>
+                <w:i w:val="0"/>
                 <w:color w:val="334155"/>
-                <w:sz w:val="20"/>
+                <w:sz w:val="18"/>
               </w:rPr>
-              <w:t>Vous n'avez pas besoin de créer plusieurs adresses e-mail ! En vous connectant avec votre adresse unique, cliquez simplement sur votre nom en haut à droite du tableau de bord. Un menu déroulant vous permet de passer d'un musicien à l'autre en un seul clic sans jamais avoir à vous déconnecter.</w:t>
+              <w:t>Si une même adresse e-mail est utilisée pour plusieurs membres de la même famille (ex: parents et enfants musiciens), vous n'avez pas besoin de créer plusieurs comptes ! En vous connectant avec votre adresse unique, cliquez simplement sur votre nom en haut à droite du tableau de bord. Un menu déroulant vous permet de passer d'un musicien à l'autre en un seul clic sans jamais avoir à vous déconnecter.</w:t>
             </w:r>
           </w:p>
         </w:tc>
@@ -993,17 +1093,14 @@
     </w:tbl>
     <w:p>
       <w:pPr>
-        <w:spacing w:after="120"/>
-      </w:pPr>
-    </w:p>
-    <w:p>
-      <w:pPr>
-        <w:pStyle w:val="Heading1"/>
-        <w:spacing w:before="280" w:after="120"/>
+        <w:spacing w:before="180" w:after="60"/>
       </w:pPr>
       <w:r>
         <w:rPr>
+          <w:rFonts w:ascii="Calibri" w:hAnsi="Calibri"/>
+          <w:b/>
           <w:color w:val="1E1B4B"/>
+          <w:sz w:val="25"/>
         </w:rPr>
         <w:t>7. Questions fréquentes (FAQ)</w:t>
       </w:r>
@@ -1014,38 +1111,39 @@
         <w:jc w:val="center"/>
         <w:tblLayout w:type="fixed"/>
         <w:tblLook w:firstColumn="1" w:firstRow="1" w:lastColumn="0" w:lastRow="0" w:noHBand="0" w:noVBand="1" w:val="04A0"/>
-        <w:tblBorders>
-          <w:top w:val="single" w:sz="6" w:space="0" w:color="CBD5E1"/>
-          <w:bottom w:val="single" w:sz="6" w:space="0" w:color="CBD5E1"/>
-          <w:insideH w:val="single" w:sz="6" w:space="0" w:color="CBD5E1"/>
-          <w:insideV w:val="none"/>
-          <w:left w:val="none"/>
-          <w:right w:val="none"/>
-        </w:tblBorders>
       </w:tblPr>
       <w:tblGrid>
-        <w:gridCol w:w="4968"/>
-        <w:gridCol w:w="4968"/>
+        <w:gridCol w:w="3168"/>
+        <w:gridCol w:w="6437"/>
       </w:tblGrid>
       <w:tr>
         <w:tc>
           <w:tcPr>
-            <w:tcW w:type="dxa" w:w="3312"/>
+            <w:tcW w:type="dxa" w:w="4802"/>
             <w:shd w:fill="F1F5F9"/>
             <w:tcMar>
-              <w:top w:w="100" w:type="dxa"/>
-              <w:bottom w:w="100" w:type="dxa"/>
-              <w:left w:w="140" w:type="dxa"/>
-              <w:right w:w="140" w:type="dxa"/>
+              <w:top w:w="50" w:type="dxa"/>
+              <w:bottom w:w="50" w:type="dxa"/>
+              <w:left w:w="80" w:type="dxa"/>
+              <w:right w:w="80" w:type="dxa"/>
             </w:tcMar>
+            <w:tcBorders>
+              <w:top w:val="single" w:sz="4" w:space="0" w:color="CBD5E1"/>
+              <w:left w:val="none" w:sz="4" w:space="0" w:color="CBD5E1"/>
+              <w:bottom w:val="single" w:sz="4" w:space="0" w:color="CBD5E1"/>
+              <w:right w:val="none" w:sz="4" w:space="0" w:color="CBD5E1"/>
+            </w:tcBorders>
           </w:tcPr>
           <w:p>
+            <w:pPr>
+              <w:spacing w:before="0" w:after="0"/>
+            </w:pPr>
             <w:r>
               <w:rPr>
                 <w:rFonts w:ascii="Calibri" w:hAnsi="Calibri"/>
                 <w:b/>
                 <w:color w:val="0F172A"/>
-                <w:sz w:val="20"/>
+                <w:sz w:val="17"/>
               </w:rPr>
               <w:t>Situation</w:t>
             </w:r>
@@ -1053,22 +1151,31 @@
         </w:tc>
         <w:tc>
           <w:tcPr>
-            <w:tcW w:type="dxa" w:w="6048"/>
+            <w:tcW w:type="dxa" w:w="4802"/>
             <w:shd w:fill="F1F5F9"/>
             <w:tcMar>
-              <w:top w:w="100" w:type="dxa"/>
-              <w:bottom w:w="100" w:type="dxa"/>
-              <w:left w:w="140" w:type="dxa"/>
-              <w:right w:w="140" w:type="dxa"/>
+              <w:top w:w="50" w:type="dxa"/>
+              <w:bottom w:w="50" w:type="dxa"/>
+              <w:left w:w="80" w:type="dxa"/>
+              <w:right w:w="80" w:type="dxa"/>
             </w:tcMar>
+            <w:tcBorders>
+              <w:top w:val="single" w:sz="4" w:space="0" w:color="CBD5E1"/>
+              <w:left w:val="none" w:sz="4" w:space="0" w:color="CBD5E1"/>
+              <w:bottom w:val="single" w:sz="4" w:space="0" w:color="CBD5E1"/>
+              <w:right w:val="none" w:sz="4" w:space="0" w:color="CBD5E1"/>
+            </w:tcBorders>
           </w:tcPr>
           <w:p>
+            <w:pPr>
+              <w:spacing w:before="0" w:after="0"/>
+            </w:pPr>
             <w:r>
               <w:rPr>
                 <w:rFonts w:ascii="Calibri" w:hAnsi="Calibri"/>
                 <w:b/>
                 <w:color w:val="0F172A"/>
-                <w:sz w:val="20"/>
+                <w:sz w:val="17"/>
               </w:rPr>
               <w:t>Solution</w:t>
             </w:r>
@@ -1078,21 +1185,31 @@
       <w:tr>
         <w:tc>
           <w:tcPr>
-            <w:tcW w:type="dxa" w:w="3312"/>
+            <w:tcW w:type="dxa" w:w="4802"/>
+            <w:shd w:fill="FFFFFF"/>
             <w:tcMar>
-              <w:top w:w="100" w:type="dxa"/>
-              <w:bottom w:w="100" w:type="dxa"/>
-              <w:left w:w="140" w:type="dxa"/>
-              <w:right w:w="140" w:type="dxa"/>
+              <w:top w:w="50" w:type="dxa"/>
+              <w:bottom w:w="50" w:type="dxa"/>
+              <w:left w:w="80" w:type="dxa"/>
+              <w:right w:w="80" w:type="dxa"/>
             </w:tcMar>
+            <w:tcBorders>
+              <w:top w:val="single" w:sz="4" w:space="0" w:color="CBD5E1"/>
+              <w:left w:val="none" w:sz="4" w:space="0" w:color="CBD5E1"/>
+              <w:bottom w:val="single" w:sz="4" w:space="0" w:color="CBD5E1"/>
+              <w:right w:val="none" w:sz="4" w:space="0" w:color="CBD5E1"/>
+            </w:tcBorders>
           </w:tcPr>
           <w:p>
+            <w:pPr>
+              <w:spacing w:before="0" w:after="0"/>
+            </w:pPr>
             <w:r>
               <w:rPr>
                 <w:rFonts w:ascii="Calibri" w:hAnsi="Calibri"/>
                 <w:b/>
                 <w:color w:val="1E293B"/>
-                <w:sz w:val="19"/>
+                <w:sz w:val="17"/>
               </w:rPr>
               <w:t>Je n'ai pas reçu le mail d'activation</w:t>
             </w:r>
@@ -1100,22 +1217,33 @@
         </w:tc>
         <w:tc>
           <w:tcPr>
-            <w:tcW w:type="dxa" w:w="6048"/>
+            <w:tcW w:type="dxa" w:w="4802"/>
+            <w:shd w:fill="FFFFFF"/>
             <w:tcMar>
-              <w:top w:w="100" w:type="dxa"/>
-              <w:bottom w:w="100" w:type="dxa"/>
-              <w:left w:w="140" w:type="dxa"/>
-              <w:right w:w="140" w:type="dxa"/>
+              <w:top w:w="50" w:type="dxa"/>
+              <w:bottom w:w="50" w:type="dxa"/>
+              <w:left w:w="80" w:type="dxa"/>
+              <w:right w:w="80" w:type="dxa"/>
             </w:tcMar>
+            <w:tcBorders>
+              <w:top w:val="single" w:sz="4" w:space="0" w:color="CBD5E1"/>
+              <w:left w:val="none" w:sz="4" w:space="0" w:color="CBD5E1"/>
+              <w:bottom w:val="single" w:sz="4" w:space="0" w:color="CBD5E1"/>
+              <w:right w:val="none" w:sz="4" w:space="0" w:color="CBD5E1"/>
+            </w:tcBorders>
           </w:tcPr>
           <w:p>
+            <w:pPr>
+              <w:spacing w:before="0" w:after="0"/>
+            </w:pPr>
             <w:r>
               <w:rPr>
                 <w:rFonts w:ascii="Calibri" w:hAnsi="Calibri"/>
+                <w:b w:val="0"/>
                 <w:color w:val="475569"/>
-                <w:sz w:val="19"/>
+                <w:sz w:val="17"/>
               </w:rPr>
-              <w:t>Vérifiez vos spams / courriers indésirables. Si le mail n'apparaît pas, signalez-le lors de la prochaine répétition pour qu'une invitation vous soit renvoyée.</w:t>
+              <w:t>Vérifiez vos spams / courriers indésirables. Si le mail n'apparaît pas, signalez-le par mail ou lors de votre prochaine venue à la Lyre.</w:t>
             </w:r>
           </w:p>
         </w:tc>
@@ -1123,21 +1251,31 @@
       <w:tr>
         <w:tc>
           <w:tcPr>
-            <w:tcW w:type="dxa" w:w="3312"/>
+            <w:tcW w:type="dxa" w:w="4802"/>
+            <w:shd w:fill="F8FAFC"/>
             <w:tcMar>
-              <w:top w:w="100" w:type="dxa"/>
-              <w:bottom w:w="100" w:type="dxa"/>
-              <w:left w:w="140" w:type="dxa"/>
-              <w:right w:w="140" w:type="dxa"/>
+              <w:top w:w="50" w:type="dxa"/>
+              <w:bottom w:w="50" w:type="dxa"/>
+              <w:left w:w="80" w:type="dxa"/>
+              <w:right w:w="80" w:type="dxa"/>
             </w:tcMar>
+            <w:tcBorders>
+              <w:top w:val="single" w:sz="4" w:space="0" w:color="CBD5E1"/>
+              <w:left w:val="none" w:sz="4" w:space="0" w:color="CBD5E1"/>
+              <w:bottom w:val="single" w:sz="4" w:space="0" w:color="CBD5E1"/>
+              <w:right w:val="none" w:sz="4" w:space="0" w:color="CBD5E1"/>
+            </w:tcBorders>
           </w:tcPr>
           <w:p>
+            <w:pPr>
+              <w:spacing w:before="0" w:after="0"/>
+            </w:pPr>
             <w:r>
               <w:rPr>
                 <w:rFonts w:ascii="Calibri" w:hAnsi="Calibri"/>
                 <w:b/>
                 <w:color w:val="1E293B"/>
-                <w:sz w:val="19"/>
+                <w:sz w:val="17"/>
               </w:rPr>
               <w:t>Le lien d'activation a expiré</w:t>
             </w:r>
@@ -1145,20 +1283,31 @@
         </w:tc>
         <w:tc>
           <w:tcPr>
-            <w:tcW w:type="dxa" w:w="6048"/>
+            <w:tcW w:type="dxa" w:w="4802"/>
+            <w:shd w:fill="F8FAFC"/>
             <w:tcMar>
-              <w:top w:w="100" w:type="dxa"/>
-              <w:bottom w:w="100" w:type="dxa"/>
-              <w:left w:w="140" w:type="dxa"/>
-              <w:right w:w="140" w:type="dxa"/>
+              <w:top w:w="50" w:type="dxa"/>
+              <w:bottom w:w="50" w:type="dxa"/>
+              <w:left w:w="80" w:type="dxa"/>
+              <w:right w:w="80" w:type="dxa"/>
             </w:tcMar>
+            <w:tcBorders>
+              <w:top w:val="single" w:sz="4" w:space="0" w:color="CBD5E1"/>
+              <w:left w:val="none" w:sz="4" w:space="0" w:color="CBD5E1"/>
+              <w:bottom w:val="single" w:sz="4" w:space="0" w:color="CBD5E1"/>
+              <w:right w:val="none" w:sz="4" w:space="0" w:color="CBD5E1"/>
+            </w:tcBorders>
           </w:tcPr>
           <w:p>
+            <w:pPr>
+              <w:spacing w:before="0" w:after="0"/>
+            </w:pPr>
             <w:r>
               <w:rPr>
                 <w:rFonts w:ascii="Calibri" w:hAnsi="Calibri"/>
+                <w:b w:val="0"/>
                 <w:color w:val="475569"/>
-                <w:sz w:val="19"/>
+                <w:sz w:val="17"/>
               </w:rPr>
               <w:t>Les liens sont valables 48 heures. Rendez-vous sur lalyre.fr/connexion et cliquez sur « Mot de passe oublié ? » pour en recevoir un nouveau immédiatement.</w:t>
             </w:r>
@@ -1168,21 +1317,31 @@
       <w:tr>
         <w:tc>
           <w:tcPr>
-            <w:tcW w:type="dxa" w:w="3312"/>
+            <w:tcW w:type="dxa" w:w="4802"/>
+            <w:shd w:fill="FFFFFF"/>
             <w:tcMar>
-              <w:top w:w="100" w:type="dxa"/>
-              <w:bottom w:w="100" w:type="dxa"/>
-              <w:left w:w="140" w:type="dxa"/>
-              <w:right w:w="140" w:type="dxa"/>
+              <w:top w:w="50" w:type="dxa"/>
+              <w:bottom w:w="50" w:type="dxa"/>
+              <w:left w:w="80" w:type="dxa"/>
+              <w:right w:w="80" w:type="dxa"/>
             </w:tcMar>
+            <w:tcBorders>
+              <w:top w:val="single" w:sz="4" w:space="0" w:color="CBD5E1"/>
+              <w:left w:val="none" w:sz="4" w:space="0" w:color="CBD5E1"/>
+              <w:bottom w:val="single" w:sz="4" w:space="0" w:color="CBD5E1"/>
+              <w:right w:val="none" w:sz="4" w:space="0" w:color="CBD5E1"/>
+            </w:tcBorders>
           </w:tcPr>
           <w:p>
+            <w:pPr>
+              <w:spacing w:before="0" w:after="0"/>
+            </w:pPr>
             <w:r>
               <w:rPr>
                 <w:rFonts w:ascii="Calibri" w:hAnsi="Calibri"/>
                 <w:b/>
                 <w:color w:val="1E293B"/>
-                <w:sz w:val="19"/>
+                <w:sz w:val="17"/>
               </w:rPr>
               <w:t>Je ne vois pas les partitions de mon pupitre</w:t>
             </w:r>
@@ -1190,20 +1349,31 @@
         </w:tc>
         <w:tc>
           <w:tcPr>
-            <w:tcW w:type="dxa" w:w="6048"/>
+            <w:tcW w:type="dxa" w:w="4802"/>
+            <w:shd w:fill="FFFFFF"/>
             <w:tcMar>
-              <w:top w:w="100" w:type="dxa"/>
-              <w:bottom w:w="100" w:type="dxa"/>
-              <w:left w:w="140" w:type="dxa"/>
-              <w:right w:w="140" w:type="dxa"/>
+              <w:top w:w="50" w:type="dxa"/>
+              <w:bottom w:w="50" w:type="dxa"/>
+              <w:left w:w="80" w:type="dxa"/>
+              <w:right w:w="80" w:type="dxa"/>
             </w:tcMar>
+            <w:tcBorders>
+              <w:top w:val="single" w:sz="4" w:space="0" w:color="CBD5E1"/>
+              <w:left w:val="none" w:sz="4" w:space="0" w:color="CBD5E1"/>
+              <w:bottom w:val="single" w:sz="4" w:space="0" w:color="CBD5E1"/>
+              <w:right w:val="none" w:sz="4" w:space="0" w:color="CBD5E1"/>
+            </w:tcBorders>
           </w:tcPr>
           <w:p>
+            <w:pPr>
+              <w:spacing w:before="0" w:after="0"/>
+            </w:pPr>
             <w:r>
               <w:rPr>
                 <w:rFonts w:ascii="Calibri" w:hAnsi="Calibri"/>
+                <w:b w:val="0"/>
                 <w:color w:val="475569"/>
-                <w:sz w:val="19"/>
+                <w:sz w:val="17"/>
               </w:rPr>
               <w:t>Vérifiez que vos instruments et vos orchestres sont bien configurés sur votre profil. Si un pupitre manque, prévenez votre chef d'orchestre ou un administrateur.</w:t>
             </w:r>
@@ -1213,7 +1383,7 @@
     </w:tbl>
     <w:p>
       <w:pPr>
-        <w:spacing w:before="320" w:after="80"/>
+        <w:spacing w:before="160" w:after="0"/>
         <w:jc w:val="center"/>
       </w:pPr>
       <w:r>
@@ -1221,15 +1391,15 @@
           <w:rFonts w:ascii="Calibri" w:hAnsi="Calibri"/>
           <w:i/>
           <w:color w:val="64748B"/>
-          <w:sz w:val="19"/>
+          <w:sz w:val="17"/>
         </w:rPr>
         <w:t>Une question ? Écrivez-nous à communication@lalyre.fr ou parlez-en directement à vos responsables lors des répétitions.</w:t>
       </w:r>
     </w:p>
     <w:sectPr>
       <w:footerReference w:type="default" r:id="rId9"/>
-      <w:pgSz w:w="12240" w:h="15840"/>
-      <w:pgMar w:top="1008" w:right="1152" w:bottom="1008" w:left="1152" w:header="720" w:footer="720" w:gutter="0"/>
+      <w:pgSz w:w="11909" w:h="16834"/>
+      <w:pgMar w:top="936" w:right="1152" w:bottom="936" w:left="1152" w:header="720" w:footer="720" w:gutter="0"/>
       <w:cols w:space="720"/>
       <w:docGrid w:linePitch="360"/>
     </w:sectPr>
@@ -1250,7 +1420,7 @@
         <w:color w:val="94A3B8"/>
         <w:sz w:val="17"/>
       </w:rPr>
-      <w:t>Société Musicale La Lyre • Guide Officiel Espace Membre</w:t>
+      <w:t>La Lyre • Guide Officiel Espace Membre</w:t>
     </w:r>
   </w:p>
 </w:ftr>

</xml_diff>